<commit_message>
Ahora sí: Portada agregada al README
</commit_message>
<xml_diff>
--- a/docs/Documentacion_Compilador_MicroC.docx
+++ b/docs/Documentacion_Compilador_MicroC.docx
@@ -1632,12 +1632,103 @@
       </w:r>
     </w:p>
     <w:sectPr>
+      <w:headerReference r:id="rId6" w:type="default"/>
+      <w:headerReference r:id="rId7" w:type="first"/>
+      <w:footerReference r:id="rId8" w:type="first"/>
       <w:pgSz w:h="15840" w:w="12240" w:orient="portrait"/>
       <w:pgMar w:bottom="1440" w:top="1440" w:left="1800" w:right="1800" w:header="720" w:footer="720"/>
       <w:pgNumType w:start="1"/>
+      <w:titlePg w:val="1"/>
     </w:sectPr>
   </w:body>
 </w:document>
+</file>
+
+<file path=word/footer1.xml><?xml version="1.0" encoding="utf-8"?>
+<w:ftr xmlns:mc="http://schemas.openxmlformats.org/markup-compatibility/2006" xmlns:o="urn:schemas-microsoft-com:office:office" xmlns:r="http://schemas.openxmlformats.org/officeDocument/2006/relationships" xmlns:m="http://schemas.openxmlformats.org/officeDocument/2006/math" xmlns:v="urn:schemas-microsoft-com:vml" xmlns:wp="http://schemas.openxmlformats.org/drawingml/2006/wordprocessingDrawing" xmlns:w10="urn:schemas-microsoft-com:office:word" xmlns:w="http://schemas.openxmlformats.org/wordprocessingml/2006/main" xmlns:wne="http://schemas.microsoft.com/office/word/2006/wordml" xmlns:sl="http://schemas.openxmlformats.org/schemaLibrary/2006/main" xmlns:a="http://schemas.openxmlformats.org/drawingml/2006/main" xmlns:pic="http://schemas.openxmlformats.org/drawingml/2006/picture" xmlns:c="http://schemas.openxmlformats.org/drawingml/2006/chart" xmlns:lc="http://schemas.openxmlformats.org/drawingml/2006/lockedCanvas" xmlns:dgm="http://schemas.openxmlformats.org/drawingml/2006/diagram" xmlns:wps="http://schemas.microsoft.com/office/word/2010/wordprocessingShape" xmlns:wpg="http://schemas.microsoft.com/office/word/2010/wordprocessingGroup" xmlns:w14="http://schemas.microsoft.com/office/word/2010/wordml" xmlns:w15="http://schemas.microsoft.com/office/word/2012/wordml" xmlns:w16="http://schemas.microsoft.com/office/word/2018/wordml" xmlns:w16cex="http://schemas.microsoft.com/office/word/2018/wordml/cex" xmlns:w16cid="http://schemas.microsoft.com/office/word/2016/wordml/cid" xmlns="http://schemas.microsoft.com/office/tasks/2019/documenttasks" xmlns:cr="http://schemas.microsoft.com/office/comments/2020/reactions">
+  <w:p>
+    <w:pPr>
+      <w:rPr/>
+    </w:pPr>
+    <w:r>
+      <w:rPr>
+        <w:rtl w:val="0"/>
+      </w:rPr>
+    </w:r>
+  </w:p>
+</w:ftr>
+</file>
+
+<file path=word/header1.xml><?xml version="1.0" encoding="utf-8"?>
+<w:hdr xmlns:mc="http://schemas.openxmlformats.org/markup-compatibility/2006" xmlns:o="urn:schemas-microsoft-com:office:office" xmlns:r="http://schemas.openxmlformats.org/officeDocument/2006/relationships" xmlns:m="http://schemas.openxmlformats.org/officeDocument/2006/math" xmlns:v="urn:schemas-microsoft-com:vml" xmlns:wp="http://schemas.openxmlformats.org/drawingml/2006/wordprocessingDrawing" xmlns:w10="urn:schemas-microsoft-com:office:word" xmlns:w="http://schemas.openxmlformats.org/wordprocessingml/2006/main" xmlns:wne="http://schemas.microsoft.com/office/word/2006/wordml" xmlns:sl="http://schemas.openxmlformats.org/schemaLibrary/2006/main" xmlns:a="http://schemas.openxmlformats.org/drawingml/2006/main" xmlns:pic="http://schemas.openxmlformats.org/drawingml/2006/picture" xmlns:c="http://schemas.openxmlformats.org/drawingml/2006/chart" xmlns:lc="http://schemas.openxmlformats.org/drawingml/2006/lockedCanvas" xmlns:dgm="http://schemas.openxmlformats.org/drawingml/2006/diagram" xmlns:wps="http://schemas.microsoft.com/office/word/2010/wordprocessingShape" xmlns:wpg="http://schemas.microsoft.com/office/word/2010/wordprocessingGroup" xmlns:w14="http://schemas.microsoft.com/office/word/2010/wordml" xmlns:w15="http://schemas.microsoft.com/office/word/2012/wordml" xmlns:w16="http://schemas.microsoft.com/office/word/2018/wordml" xmlns:w16cex="http://schemas.microsoft.com/office/word/2018/wordml/cex" xmlns:w16cid="http://schemas.microsoft.com/office/word/2016/wordml/cid" xmlns="http://schemas.microsoft.com/office/tasks/2019/documenttasks" xmlns:cr="http://schemas.microsoft.com/office/comments/2020/reactions">
+  <w:p>
+    <w:pPr>
+      <w:rPr/>
+    </w:pPr>
+    <w:r>
+      <w:rPr>
+        <w:rtl w:val="0"/>
+      </w:rPr>
+    </w:r>
+  </w:p>
+</w:hdr>
+</file>
+
+<file path=word/header2.xml><?xml version="1.0" encoding="utf-8"?>
+<w:hdr xmlns:mc="http://schemas.openxmlformats.org/markup-compatibility/2006" xmlns:o="urn:schemas-microsoft-com:office:office" xmlns:r="http://schemas.openxmlformats.org/officeDocument/2006/relationships" xmlns:m="http://schemas.openxmlformats.org/officeDocument/2006/math" xmlns:v="urn:schemas-microsoft-com:vml" xmlns:wp="http://schemas.openxmlformats.org/drawingml/2006/wordprocessingDrawing" xmlns:w10="urn:schemas-microsoft-com:office:word" xmlns:w="http://schemas.openxmlformats.org/wordprocessingml/2006/main" xmlns:wne="http://schemas.microsoft.com/office/word/2006/wordml" xmlns:sl="http://schemas.openxmlformats.org/schemaLibrary/2006/main" xmlns:a="http://schemas.openxmlformats.org/drawingml/2006/main" xmlns:pic="http://schemas.openxmlformats.org/drawingml/2006/picture" xmlns:c="http://schemas.openxmlformats.org/drawingml/2006/chart" xmlns:lc="http://schemas.openxmlformats.org/drawingml/2006/lockedCanvas" xmlns:dgm="http://schemas.openxmlformats.org/drawingml/2006/diagram" xmlns:wps="http://schemas.microsoft.com/office/word/2010/wordprocessingShape" xmlns:wpg="http://schemas.microsoft.com/office/word/2010/wordprocessingGroup" xmlns:w14="http://schemas.microsoft.com/office/word/2010/wordml" xmlns:w15="http://schemas.microsoft.com/office/word/2012/wordml" xmlns:w16="http://schemas.microsoft.com/office/word/2018/wordml" xmlns:w16cex="http://schemas.microsoft.com/office/word/2018/wordml/cex" xmlns:w16cid="http://schemas.microsoft.com/office/word/2016/wordml/cid" xmlns="http://schemas.microsoft.com/office/tasks/2019/documenttasks" xmlns:cr="http://schemas.microsoft.com/office/comments/2020/reactions">
+  <w:p>
+    <w:pPr>
+      <w:rPr/>
+    </w:pPr>
+    <w:r>
+      <w:rPr>
+        <w:rtl w:val="0"/>
+      </w:rPr>
+    </w:r>
+    <w:r>
+      <w:drawing>
+        <wp:anchor allowOverlap="1" behindDoc="1" distB="114300" distT="114300" distL="114300" distR="114300" hidden="0" layoutInCell="1" locked="0" relativeHeight="0" simplePos="0">
+          <wp:simplePos x="0" y="0"/>
+          <wp:positionH relativeFrom="column">
+            <wp:posOffset>4362450</wp:posOffset>
+          </wp:positionH>
+          <wp:positionV relativeFrom="paragraph">
+            <wp:posOffset>-342899</wp:posOffset>
+          </wp:positionV>
+          <wp:extent cx="2658482" cy="2052638"/>
+          <wp:effectExtent b="0" l="0" r="0" t="0"/>
+          <wp:wrapNone/>
+          <wp:docPr id="1" name="image1.png"/>
+          <a:graphic>
+            <a:graphicData uri="http://schemas.openxmlformats.org/drawingml/2006/picture">
+              <pic:pic>
+                <pic:nvPicPr>
+                  <pic:cNvPr id="0" name="image1.png"/>
+                  <pic:cNvPicPr preferRelativeResize="0"/>
+                </pic:nvPicPr>
+                <pic:blipFill>
+                  <a:blip r:embed="rId1"/>
+                  <a:srcRect b="-2203" l="1701" r="-1701" t="2203"/>
+                  <a:stretch>
+                    <a:fillRect/>
+                  </a:stretch>
+                </pic:blipFill>
+                <pic:spPr>
+                  <a:xfrm>
+                    <a:off x="0" y="0"/>
+                    <a:ext cx="2658482" cy="2052638"/>
+                  </a:xfrm>
+                  <a:prstGeom prst="rect"/>
+                  <a:ln/>
+                </pic:spPr>
+              </pic:pic>
+            </a:graphicData>
+          </a:graphic>
+        </wp:anchor>
+      </w:drawing>
+    </w:r>
+  </w:p>
+</w:hdr>
 </file>
 
 <file path=word/numbering.xml><?xml version="1.0" encoding="utf-8"?>

</xml_diff>